<commit_message>
Bearbeitung semantische Dichte Lehrkraft icas.sql zurückgesetzt
</commit_message>
<xml_diff>
--- a/library/php/kapitel6/semantischeDichte/6.X Semantische Dichte im FRZK-Zustandsraum.docx
+++ b/library/php/kapitel6/semantischeDichte/6.X Semantische Dichte im FRZK-Zustandsraum.docx
@@ -1021,12 +1021,22 @@
     </w:p>
     <w:p>
       <w:r>
-        <w:t>Diese Unterscheidung ist entscheidend:</w:t>
-      </w:r>
-    </w:p>
-    <w:p>
-      <w:r>
-        <w:t>Rohsubjektivität ist nicht identisch mit modellierter Subjektivität.</w:t>
+        <w:t>Diese Unterscheidung ist entscheidend</w:t>
+      </w:r>
+      <w:r>
+        <w:t xml:space="preserve">, da </w:t>
+      </w:r>
+      <w:r>
+        <w:t>Rohsubjektivität nicht identisch mit modellierter Subjektivität</w:t>
+      </w:r>
+      <w:r>
+        <w:t xml:space="preserve"> </w:t>
+      </w:r>
+      <w:r>
+        <w:t>ist</w:t>
+      </w:r>
+      <w:r>
+        <w:t>.</w:t>
       </w:r>
     </w:p>
     <w:p>
@@ -1628,318 +1638,66 @@
     </w:p>
     <w:p>
       <w:pPr>
-        <w:spacing w:before="100" w:beforeAutospacing="1" w:after="100" w:afterAutospacing="1"/>
-        <w:outlineLvl w:val="2"/>
-        <w:rPr>
-          <w:rFonts w:ascii="Calibri Light" w:hAnsi="Calibri Light"/>
-          <w:b/>
-          <w:sz w:val="32"/>
-          <w:szCs w:val="26"/>
-        </w:rPr>
-      </w:pPr>
-      <w:r>
-        <w:rPr>
-          <w:rFonts w:ascii="Calibri Light" w:hAnsi="Calibri Light"/>
-          <w:b/>
-          <w:sz w:val="32"/>
-          <w:szCs w:val="26"/>
-        </w:rPr>
-        <w:t>Si(t)=1−</w:t>
-      </w:r>
-      <w:proofErr w:type="gramStart"/>
-      <w:r>
-        <w:rPr>
-          <w:rFonts w:ascii="Calibri Light" w:hAnsi="Calibri Light"/>
-          <w:b/>
-          <w:sz w:val="32"/>
-          <w:szCs w:val="26"/>
-        </w:rPr>
-        <w:t>Var</w:t>
-      </w:r>
-      <w:r>
-        <w:rPr>
-          <w:rFonts w:ascii="Cambria Math" w:hAnsi="Cambria Math" w:cs="Cambria Math"/>
-          <w:b/>
-          <w:sz w:val="32"/>
-          <w:szCs w:val="26"/>
-        </w:rPr>
-        <w:t>⁡</w:t>
-      </w:r>
-      <w:r>
-        <w:rPr>
-          <w:rFonts w:ascii="Calibri Light" w:hAnsi="Calibri Light"/>
-          <w:b/>
-          <w:sz w:val="32"/>
-          <w:szCs w:val="26"/>
-        </w:rPr>
-        <w:t>(</w:t>
-      </w:r>
-      <w:proofErr w:type="spellStart"/>
-      <w:proofErr w:type="gramEnd"/>
-      <w:r>
-        <w:rPr>
-          <w:rFonts w:ascii="Calibri Light" w:hAnsi="Calibri Light"/>
-          <w:b/>
-          <w:sz w:val="32"/>
-          <w:szCs w:val="26"/>
-        </w:rPr>
-        <w:t>p</w:t>
-      </w:r>
-      <w:r>
-        <w:rPr>
-          <w:rFonts w:ascii="Segoe UI Symbol" w:hAnsi="Segoe UI Symbol" w:cs="Segoe UI Symbol"/>
-          <w:b/>
-          <w:sz w:val="32"/>
-          <w:szCs w:val="26"/>
-        </w:rPr>
-        <w:t>⃗</w:t>
-      </w:r>
-      <w:r>
-        <w:rPr>
-          <w:rFonts w:ascii="Calibri Light" w:hAnsi="Calibri Light"/>
-          <w:b/>
-          <w:sz w:val="32"/>
-          <w:szCs w:val="26"/>
-        </w:rPr>
-        <w:t>S,i</w:t>
-      </w:r>
-      <w:proofErr w:type="spellEnd"/>
-      <w:r>
-        <w:rPr>
-          <w:rFonts w:ascii="Calibri Light" w:hAnsi="Calibri Light"/>
-          <w:b/>
-          <w:sz w:val="32"/>
-          <w:szCs w:val="26"/>
-        </w:rPr>
-        <w:t>(t</w:t>
-      </w:r>
-      <w:r>
-        <w:rPr>
-          <w:rFonts w:ascii="Calibri Light" w:hAnsi="Calibri Light" w:cs="Calibri Light"/>
-          <w:b/>
-          <w:sz w:val="32"/>
-          <w:szCs w:val="26"/>
-        </w:rPr>
-        <w:t>−</w:t>
-      </w:r>
-      <w:proofErr w:type="spellStart"/>
-      <w:r>
-        <w:rPr>
-          <w:rFonts w:ascii="Calibri Light" w:hAnsi="Calibri Light" w:cs="Calibri Light"/>
-          <w:b/>
-          <w:sz w:val="32"/>
-          <w:szCs w:val="26"/>
-        </w:rPr>
-        <w:t>Δ</w:t>
-      </w:r>
-      <w:r>
-        <w:rPr>
-          <w:rFonts w:ascii="Calibri Light" w:hAnsi="Calibri Light"/>
-          <w:b/>
-          <w:sz w:val="32"/>
-          <w:szCs w:val="26"/>
-        </w:rPr>
-        <w:t>t</w:t>
-      </w:r>
-      <w:proofErr w:type="spellEnd"/>
-      <w:r>
-        <w:rPr>
-          <w:rFonts w:ascii="Calibri Light" w:hAnsi="Calibri Light" w:cs="Calibri Light"/>
-          <w:b/>
-          <w:sz w:val="32"/>
-          <w:szCs w:val="26"/>
-        </w:rPr>
-        <w:t>…</w:t>
-      </w:r>
-      <w:r>
-        <w:rPr>
-          <w:rFonts w:ascii="Calibri Light" w:hAnsi="Calibri Light"/>
-          <w:b/>
-          <w:sz w:val="32"/>
-          <w:szCs w:val="26"/>
-        </w:rPr>
-        <w:t>t))</w:t>
-      </w:r>
-      <w:proofErr w:type="spellStart"/>
-      <w:r>
-        <w:rPr>
-          <w:rFonts w:ascii="Calibri Light" w:hAnsi="Calibri Light"/>
-          <w:b/>
-          <w:sz w:val="32"/>
-          <w:szCs w:val="26"/>
-        </w:rPr>
-        <w:t>S_i</w:t>
-      </w:r>
-      <w:proofErr w:type="spellEnd"/>
-      <w:r>
-        <w:rPr>
-          <w:rFonts w:ascii="Calibri Light" w:hAnsi="Calibri Light"/>
-          <w:b/>
-          <w:sz w:val="32"/>
-          <w:szCs w:val="26"/>
-        </w:rPr>
-        <w:t>(t) = 1 - \</w:t>
-      </w:r>
-      <w:proofErr w:type="spellStart"/>
-      <w:r>
-        <w:rPr>
-          <w:rFonts w:ascii="Calibri Light" w:hAnsi="Calibri Light"/>
-          <w:b/>
-          <w:sz w:val="32"/>
-          <w:szCs w:val="26"/>
-        </w:rPr>
-        <w:t>operatorname</w:t>
-      </w:r>
-      <w:proofErr w:type="spellEnd"/>
-      <w:r>
-        <w:rPr>
-          <w:rFonts w:ascii="Calibri Light" w:hAnsi="Calibri Light"/>
-          <w:b/>
-          <w:sz w:val="32"/>
-          <w:szCs w:val="26"/>
-        </w:rPr>
-        <w:t>{Var}\</w:t>
-      </w:r>
-      <w:proofErr w:type="spellStart"/>
-      <w:r>
-        <w:rPr>
-          <w:rFonts w:ascii="Calibri Light" w:hAnsi="Calibri Light"/>
-          <w:b/>
-          <w:sz w:val="32"/>
-          <w:szCs w:val="26"/>
-        </w:rPr>
-        <w:t>left</w:t>
-      </w:r>
-      <w:proofErr w:type="spellEnd"/>
-      <w:r>
-        <w:rPr>
-          <w:rFonts w:ascii="Calibri Light" w:hAnsi="Calibri Light"/>
-          <w:b/>
-          <w:sz w:val="32"/>
-          <w:szCs w:val="26"/>
-        </w:rPr>
-        <w:t>(\</w:t>
-      </w:r>
-      <w:proofErr w:type="spellStart"/>
-      <w:r>
-        <w:rPr>
-          <w:rFonts w:ascii="Calibri Light" w:hAnsi="Calibri Light"/>
-          <w:b/>
-          <w:sz w:val="32"/>
-          <w:szCs w:val="26"/>
-        </w:rPr>
-        <w:t>vec</w:t>
-      </w:r>
-      <w:proofErr w:type="spellEnd"/>
-      <w:r>
-        <w:rPr>
-          <w:rFonts w:ascii="Calibri Light" w:hAnsi="Calibri Light"/>
-          <w:b/>
-          <w:sz w:val="32"/>
-          <w:szCs w:val="26"/>
-        </w:rPr>
-        <w:t>{p}_{</w:t>
-      </w:r>
-      <w:proofErr w:type="spellStart"/>
-      <w:r>
-        <w:rPr>
-          <w:rFonts w:ascii="Calibri Light" w:hAnsi="Calibri Light"/>
-          <w:b/>
-          <w:sz w:val="32"/>
-          <w:szCs w:val="26"/>
-        </w:rPr>
-        <w:t>S,i</w:t>
-      </w:r>
-      <w:proofErr w:type="spellEnd"/>
-      <w:r>
-        <w:rPr>
-          <w:rFonts w:ascii="Calibri Light" w:hAnsi="Calibri Light"/>
-          <w:b/>
-          <w:sz w:val="32"/>
-          <w:szCs w:val="26"/>
-        </w:rPr>
-        <w:t>}(t-\Delta t \</w:t>
-      </w:r>
-      <w:proofErr w:type="spellStart"/>
-      <w:r>
-        <w:rPr>
-          <w:rFonts w:ascii="Calibri Light" w:hAnsi="Calibri Light"/>
-          <w:b/>
-          <w:sz w:val="32"/>
-          <w:szCs w:val="26"/>
-        </w:rPr>
-        <w:t>dots</w:t>
-      </w:r>
-      <w:proofErr w:type="spellEnd"/>
-      <w:r>
-        <w:rPr>
-          <w:rFonts w:ascii="Calibri Light" w:hAnsi="Calibri Light"/>
-          <w:b/>
-          <w:sz w:val="32"/>
-          <w:szCs w:val="26"/>
-        </w:rPr>
-        <w:t xml:space="preserve"> t)\</w:t>
-      </w:r>
-      <w:proofErr w:type="spellStart"/>
-      <w:r>
-        <w:rPr>
-          <w:rFonts w:ascii="Calibri Light" w:hAnsi="Calibri Light"/>
-          <w:b/>
-          <w:sz w:val="32"/>
-          <w:szCs w:val="26"/>
-        </w:rPr>
-        <w:t>right</w:t>
-      </w:r>
-      <w:proofErr w:type="spellEnd"/>
-      <w:r>
-        <w:rPr>
-          <w:rFonts w:ascii="Calibri Light" w:hAnsi="Calibri Light"/>
-          <w:b/>
-          <w:sz w:val="32"/>
-          <w:szCs w:val="26"/>
-        </w:rPr>
-        <w:t>)Si​(t)=1−Var(p​</w:t>
-      </w:r>
-      <w:proofErr w:type="spellStart"/>
-      <w:r>
-        <w:rPr>
-          <w:rFonts w:ascii="Calibri Light" w:hAnsi="Calibri Light"/>
-          <w:b/>
-          <w:sz w:val="32"/>
-          <w:szCs w:val="26"/>
-        </w:rPr>
-        <w:t>S,i</w:t>
-      </w:r>
-      <w:proofErr w:type="spellEnd"/>
-      <w:r>
-        <w:rPr>
-          <w:rFonts w:ascii="Calibri Light" w:hAnsi="Calibri Light"/>
-          <w:b/>
-          <w:sz w:val="32"/>
-          <w:szCs w:val="26"/>
-        </w:rPr>
-        <w:t>​(t−</w:t>
-      </w:r>
-      <w:proofErr w:type="spellStart"/>
-      <w:r>
-        <w:rPr>
-          <w:rFonts w:ascii="Calibri Light" w:hAnsi="Calibri Light"/>
-          <w:b/>
-          <w:sz w:val="32"/>
-          <w:szCs w:val="26"/>
-        </w:rPr>
-        <w:t>Δt</w:t>
-      </w:r>
-      <w:proofErr w:type="spellEnd"/>
-      <w:r>
-        <w:rPr>
-          <w:rFonts w:ascii="Calibri Light" w:hAnsi="Calibri Light"/>
-          <w:b/>
-          <w:sz w:val="32"/>
-          <w:szCs w:val="26"/>
-        </w:rPr>
-        <w:t xml:space="preserve">…t)) </w:t>
-      </w:r>
+        <w:pStyle w:val="Formel"/>
+      </w:pPr>
+      <m:oMathPara>
+        <m:oMath>
+          <m:sSub>
+            <m:sSubPr>
+              <m:ctrlPr/>
+            </m:sSubPr>
+            <m:e>
+              <m:r>
+                <m:t>S</m:t>
+              </m:r>
+            </m:e>
+            <m:sub>
+              <m:r>
+                <m:t>i</m:t>
+              </m:r>
+            </m:sub>
+          </m:sSub>
+          <m:d>
+            <m:dPr>
+              <m:ctrlPr/>
+            </m:dPr>
+            <m:e>
+              <m:r>
+                <m:t>t</m:t>
+              </m:r>
+            </m:e>
+          </m:d>
+          <m:r>
+            <m:t>=1-Var(</m:t>
+          </m:r>
+          <m:sSub>
+            <m:sSubPr>
+              <m:ctrlPr/>
+            </m:sSubPr>
+            <m:e>
+              <m:acc>
+                <m:accPr>
+                  <m:chr m:val="⃗"/>
+                  <m:ctrlPr/>
+                </m:accPr>
+                <m:e>
+                  <m:r>
+                    <m:t>p</m:t>
+                  </m:r>
+                </m:e>
+              </m:acc>
+            </m:e>
+            <m:sub>
+              <m:r>
+                <m:t>S,i</m:t>
+              </m:r>
+            </m:sub>
+          </m:sSub>
+          <m:r>
+            <m:t>(t-∆t…t))</m:t>
+          </m:r>
+        </m:oMath>
+      </m:oMathPara>
     </w:p>
     <w:p>
       <w:r>
@@ -1948,57 +1706,22 @@
     </w:p>
     <w:p>
       <w:pPr>
-        <w:numPr>
-          <w:ilvl w:val="0"/>
-          <w:numId w:val="13"/>
-        </w:numPr>
-        <w:spacing w:before="100" w:beforeAutospacing="1" w:after="100" w:afterAutospacing="1"/>
-        <w:outlineLvl w:val="2"/>
-        <w:rPr>
-          <w:rFonts w:ascii="Calibri Light" w:hAnsi="Calibri Light"/>
-          <w:b/>
-          <w:sz w:val="32"/>
-          <w:szCs w:val="26"/>
-        </w:rPr>
-      </w:pPr>
-      <w:r>
-        <w:rPr>
-          <w:rFonts w:ascii="Calibri Light" w:hAnsi="Calibri Light"/>
-          <w:b/>
-          <w:sz w:val="32"/>
-          <w:szCs w:val="26"/>
-        </w:rPr>
+        <w:pStyle w:val="Aufzhlung"/>
+      </w:pPr>
+      <w:r>
         <w:t>konsolidierte epistemische Lage</w:t>
       </w:r>
     </w:p>
     <w:p>
       <w:pPr>
-        <w:numPr>
-          <w:ilvl w:val="0"/>
-          <w:numId w:val="13"/>
-        </w:numPr>
-        <w:spacing w:before="100" w:beforeAutospacing="1" w:after="100" w:afterAutospacing="1"/>
-        <w:outlineLvl w:val="2"/>
-        <w:rPr>
-          <w:rFonts w:ascii="Calibri Light" w:hAnsi="Calibri Light"/>
-          <w:b/>
-          <w:sz w:val="32"/>
-          <w:szCs w:val="26"/>
-        </w:rPr>
-      </w:pPr>
-      <w:r>
-        <w:rPr>
-          <w:rFonts w:ascii="Calibri Light" w:hAnsi="Calibri Light"/>
-          <w:b/>
-          <w:sz w:val="32"/>
-          <w:szCs w:val="26"/>
-        </w:rPr>
+        <w:pStyle w:val="Aufzhlung"/>
+      </w:pPr>
+      <w:r>
         <w:t>geringe Zustandsfluktuation</w:t>
       </w:r>
     </w:p>
     <w:p>
       <w:r>
-        <w:lastRenderedPageBreak/>
         <w:t xml:space="preserve">Dies entspricht prozessualen Lernmodellen (Winne &amp; </w:t>
       </w:r>
       <w:proofErr w:type="spellStart"/>
@@ -2061,6 +1784,7 @@
           <w:sz w:val="32"/>
           <w:szCs w:val="26"/>
         </w:rPr>
+        <w:lastRenderedPageBreak/>
         <w:t>3.X.3.5 Distanz-Nachweis (D)</w:t>
       </w:r>
     </w:p>
@@ -2069,7 +1793,9 @@
         <w:t>Die Teilnehmersicht wird im Multimodal-FRZK relational analysiert.</w:t>
       </w:r>
       <w:r>
-        <w:br/>
+        <w:t xml:space="preserve"> </w:t>
+      </w:r>
+      <w:r>
         <w:t>Dazu wird die Distanz zur Lehrkraftposition berechnet.</w:t>
       </w:r>
     </w:p>
@@ -2080,322 +1806,140 @@
     </w:p>
     <w:p>
       <w:pPr>
-        <w:spacing w:before="100" w:beforeAutospacing="1" w:after="100" w:afterAutospacing="1"/>
-        <w:outlineLvl w:val="2"/>
-        <w:rPr>
-          <w:rFonts w:ascii="Calibri Light" w:hAnsi="Calibri Light"/>
-          <w:b/>
-          <w:sz w:val="32"/>
-          <w:szCs w:val="26"/>
-        </w:rPr>
-      </w:pPr>
+        <w:pStyle w:val="Formel"/>
+      </w:pPr>
+      <m:oMathPara>
+        <m:oMath>
+          <m:sSub>
+            <m:sSubPr>
+              <m:ctrlPr/>
+            </m:sSubPr>
+            <m:e>
+              <m:acc>
+                <m:accPr>
+                  <m:chr m:val="⃗"/>
+                  <m:ctrlPr/>
+                </m:accPr>
+                <m:e>
+                  <m:r>
+                    <m:t>p</m:t>
+                  </m:r>
+                </m:e>
+              </m:acc>
+            </m:e>
+            <m:sub>
+              <m:r>
+                <m:t>L</m:t>
+              </m:r>
+              <m:r>
+                <m:t>,i</m:t>
+              </m:r>
+            </m:sub>
+          </m:sSub>
+          <m:r>
+            <m:t>=(</m:t>
+          </m:r>
+          <m:m>
+            <m:mPr>
+              <m:mcs>
+                <m:mc>
+                  <m:mcPr>
+                    <m:count m:val="1"/>
+                    <m:mcJc m:val="center"/>
+                  </m:mcPr>
+                </m:mc>
+              </m:mcs>
+              <m:ctrlPr>
+                <w:rPr>
+                  <w:rFonts w:hAnsi="Calibri"/>
+                </w:rPr>
+              </m:ctrlPr>
+            </m:mPr>
+            <m:mr>
+              <m:e>
+                <m:sSub>
+                  <m:sSubPr>
+                    <m:ctrlPr>
+                      <w:rPr>
+                        <w:rFonts w:hAnsi="Calibri"/>
+                      </w:rPr>
+                    </m:ctrlPr>
+                  </m:sSubPr>
+                  <m:e>
+                    <m:r>
+                      <m:t>x</m:t>
+                    </m:r>
+                  </m:e>
+                  <m:sub>
+                    <m:r>
+                      <m:t>L</m:t>
+                    </m:r>
+                  </m:sub>
+                </m:sSub>
+              </m:e>
+            </m:mr>
+            <m:mr>
+              <m:e>
+                <m:sSub>
+                  <m:sSubPr>
+                    <m:ctrlPr>
+                      <w:rPr>
+                        <w:rFonts w:hAnsi="Calibri"/>
+                      </w:rPr>
+                    </m:ctrlPr>
+                  </m:sSubPr>
+                  <m:e>
+                    <m:r>
+                      <m:t>y</m:t>
+                    </m:r>
+                  </m:e>
+                  <m:sub>
+                    <m:r>
+                      <m:t>L</m:t>
+                    </m:r>
+                  </m:sub>
+                </m:sSub>
+              </m:e>
+            </m:mr>
+            <m:mr>
+              <m:e>
+                <m:sSub>
+                  <m:sSubPr>
+                    <m:ctrlPr>
+                      <w:rPr>
+                        <w:rFonts w:hAnsi="Calibri"/>
+                      </w:rPr>
+                    </m:ctrlPr>
+                  </m:sSubPr>
+                  <m:e>
+                    <m:r>
+                      <m:t>z</m:t>
+                    </m:r>
+                  </m:e>
+                  <m:sub>
+                    <m:r>
+                      <m:t>L</m:t>
+                    </m:r>
+                  </m:sub>
+                </m:sSub>
+              </m:e>
+            </m:mr>
+          </m:m>
+          <m:r>
+            <m:t>)</m:t>
+          </m:r>
+        </m:oMath>
+      </m:oMathPara>
+    </w:p>
+    <w:p>
+      <w:r>
+        <w:t xml:space="preserve">aggregiert aus </w:t>
+      </w:r>
       <w:proofErr w:type="spellStart"/>
-      <w:proofErr w:type="gramStart"/>
-      <w:r>
-        <w:rPr>
-          <w:rFonts w:ascii="Calibri Light" w:hAnsi="Calibri Light"/>
-          <w:b/>
-          <w:sz w:val="32"/>
-          <w:szCs w:val="26"/>
-        </w:rPr>
-        <w:t>p</w:t>
-      </w:r>
-      <w:r>
-        <w:rPr>
-          <w:rFonts w:ascii="Segoe UI Symbol" w:hAnsi="Segoe UI Symbol" w:cs="Segoe UI Symbol"/>
-          <w:b/>
-          <w:sz w:val="32"/>
-          <w:szCs w:val="26"/>
-        </w:rPr>
-        <w:t>⃗</w:t>
-      </w:r>
-      <w:r>
-        <w:rPr>
-          <w:rFonts w:ascii="Calibri Light" w:hAnsi="Calibri Light"/>
-          <w:b/>
-          <w:sz w:val="32"/>
-          <w:szCs w:val="26"/>
-        </w:rPr>
-        <w:t>L,i</w:t>
-      </w:r>
-      <w:proofErr w:type="spellEnd"/>
-      <w:proofErr w:type="gramEnd"/>
-      <w:r>
-        <w:rPr>
-          <w:rFonts w:ascii="Calibri Light" w:hAnsi="Calibri Light"/>
-          <w:b/>
-          <w:sz w:val="32"/>
-          <w:szCs w:val="26"/>
-        </w:rPr>
-        <w:t>=(</w:t>
-      </w:r>
-      <w:proofErr w:type="spellStart"/>
-      <w:r>
-        <w:rPr>
-          <w:rFonts w:ascii="Calibri Light" w:hAnsi="Calibri Light"/>
-          <w:b/>
-          <w:sz w:val="32"/>
-          <w:szCs w:val="26"/>
-        </w:rPr>
-        <w:t>xLyLzL</w:t>
-      </w:r>
-      <w:proofErr w:type="spellEnd"/>
-      <w:r>
-        <w:rPr>
-          <w:rFonts w:ascii="Calibri Light" w:hAnsi="Calibri Light"/>
-          <w:b/>
-          <w:sz w:val="32"/>
-          <w:szCs w:val="26"/>
-        </w:rPr>
-        <w:t>)\</w:t>
-      </w:r>
-      <w:proofErr w:type="spellStart"/>
-      <w:r>
-        <w:rPr>
-          <w:rFonts w:ascii="Calibri Light" w:hAnsi="Calibri Light"/>
-          <w:b/>
-          <w:sz w:val="32"/>
-          <w:szCs w:val="26"/>
-        </w:rPr>
-        <w:t>vec</w:t>
-      </w:r>
-      <w:proofErr w:type="spellEnd"/>
-      <w:r>
-        <w:rPr>
-          <w:rFonts w:ascii="Calibri Light" w:hAnsi="Calibri Light"/>
-          <w:b/>
-          <w:sz w:val="32"/>
-          <w:szCs w:val="26"/>
-        </w:rPr>
-        <w:t>{p}_{</w:t>
-      </w:r>
-      <w:proofErr w:type="spellStart"/>
-      <w:r>
-        <w:rPr>
-          <w:rFonts w:ascii="Calibri Light" w:hAnsi="Calibri Light"/>
-          <w:b/>
-          <w:sz w:val="32"/>
-          <w:szCs w:val="26"/>
-        </w:rPr>
-        <w:t>L,i</w:t>
-      </w:r>
-      <w:proofErr w:type="spellEnd"/>
-      <w:r>
-        <w:rPr>
-          <w:rFonts w:ascii="Calibri Light" w:hAnsi="Calibri Light"/>
-          <w:b/>
-          <w:sz w:val="32"/>
-          <w:szCs w:val="26"/>
-        </w:rPr>
-        <w:t>} = \</w:t>
-      </w:r>
-      <w:proofErr w:type="spellStart"/>
-      <w:r>
-        <w:rPr>
-          <w:rFonts w:ascii="Calibri Light" w:hAnsi="Calibri Light"/>
-          <w:b/>
-          <w:sz w:val="32"/>
-          <w:szCs w:val="26"/>
-        </w:rPr>
-        <w:t>begin</w:t>
-      </w:r>
-      <w:proofErr w:type="spellEnd"/>
-      <w:r>
-        <w:rPr>
-          <w:rFonts w:ascii="Calibri Light" w:hAnsi="Calibri Light"/>
-          <w:b/>
-          <w:sz w:val="32"/>
-          <w:szCs w:val="26"/>
-        </w:rPr>
-        <w:t>{</w:t>
-      </w:r>
-      <w:proofErr w:type="spellStart"/>
-      <w:r>
-        <w:rPr>
-          <w:rFonts w:ascii="Calibri Light" w:hAnsi="Calibri Light"/>
-          <w:b/>
-          <w:sz w:val="32"/>
-          <w:szCs w:val="26"/>
-        </w:rPr>
-        <w:t>pmatrix</w:t>
-      </w:r>
-      <w:proofErr w:type="spellEnd"/>
-      <w:r>
-        <w:rPr>
-          <w:rFonts w:ascii="Calibri Light" w:hAnsi="Calibri Light"/>
-          <w:b/>
-          <w:sz w:val="32"/>
-          <w:szCs w:val="26"/>
-        </w:rPr>
-        <w:t xml:space="preserve">} </w:t>
-      </w:r>
-      <w:proofErr w:type="spellStart"/>
-      <w:r>
-        <w:rPr>
-          <w:rFonts w:ascii="Calibri Light" w:hAnsi="Calibri Light"/>
-          <w:b/>
-          <w:sz w:val="32"/>
-          <w:szCs w:val="26"/>
-        </w:rPr>
-        <w:t>x_L</w:t>
-      </w:r>
-      <w:proofErr w:type="spellEnd"/>
-      <w:r>
-        <w:rPr>
-          <w:rFonts w:ascii="Calibri Light" w:hAnsi="Calibri Light"/>
-          <w:b/>
-          <w:sz w:val="32"/>
-          <w:szCs w:val="26"/>
-        </w:rPr>
-        <w:t xml:space="preserve"> \\ </w:t>
-      </w:r>
-      <w:proofErr w:type="spellStart"/>
-      <w:r>
-        <w:rPr>
-          <w:rFonts w:ascii="Calibri Light" w:hAnsi="Calibri Light"/>
-          <w:b/>
-          <w:sz w:val="32"/>
-          <w:szCs w:val="26"/>
-        </w:rPr>
-        <w:t>y_L</w:t>
-      </w:r>
-      <w:proofErr w:type="spellEnd"/>
-      <w:r>
-        <w:rPr>
-          <w:rFonts w:ascii="Calibri Light" w:hAnsi="Calibri Light"/>
-          <w:b/>
-          <w:sz w:val="32"/>
-          <w:szCs w:val="26"/>
-        </w:rPr>
-        <w:t xml:space="preserve"> \\ </w:t>
-      </w:r>
-      <w:proofErr w:type="spellStart"/>
-      <w:r>
-        <w:rPr>
-          <w:rFonts w:ascii="Calibri Light" w:hAnsi="Calibri Light"/>
-          <w:b/>
-          <w:sz w:val="32"/>
-          <w:szCs w:val="26"/>
-        </w:rPr>
-        <w:t>z_L</w:t>
-      </w:r>
-      <w:proofErr w:type="spellEnd"/>
-      <w:r>
-        <w:rPr>
-          <w:rFonts w:ascii="Calibri Light" w:hAnsi="Calibri Light"/>
-          <w:b/>
-          <w:sz w:val="32"/>
-          <w:szCs w:val="26"/>
-        </w:rPr>
-        <w:t xml:space="preserve"> \end{</w:t>
-      </w:r>
-      <w:proofErr w:type="spellStart"/>
-      <w:r>
-        <w:rPr>
-          <w:rFonts w:ascii="Calibri Light" w:hAnsi="Calibri Light"/>
-          <w:b/>
-          <w:sz w:val="32"/>
-          <w:szCs w:val="26"/>
-        </w:rPr>
-        <w:t>pmatrix</w:t>
-      </w:r>
-      <w:proofErr w:type="spellEnd"/>
-      <w:r>
-        <w:rPr>
-          <w:rFonts w:ascii="Calibri Light" w:hAnsi="Calibri Light"/>
-          <w:b/>
-          <w:sz w:val="32"/>
-          <w:szCs w:val="26"/>
-        </w:rPr>
-        <w:t>}p​</w:t>
-      </w:r>
-      <w:proofErr w:type="spellStart"/>
-      <w:r>
-        <w:rPr>
-          <w:rFonts w:ascii="Calibri Light" w:hAnsi="Calibri Light"/>
-          <w:b/>
-          <w:sz w:val="32"/>
-          <w:szCs w:val="26"/>
-        </w:rPr>
-        <w:t>L,i</w:t>
-      </w:r>
-      <w:proofErr w:type="spellEnd"/>
-      <w:r>
-        <w:rPr>
-          <w:rFonts w:ascii="Calibri Light" w:hAnsi="Calibri Light"/>
-          <w:b/>
-          <w:sz w:val="32"/>
-          <w:szCs w:val="26"/>
-        </w:rPr>
-        <w:t>​=​</w:t>
-      </w:r>
-      <w:proofErr w:type="spellStart"/>
-      <w:r>
-        <w:rPr>
-          <w:rFonts w:ascii="Calibri Light" w:hAnsi="Calibri Light"/>
-          <w:b/>
-          <w:sz w:val="32"/>
-          <w:szCs w:val="26"/>
-        </w:rPr>
-        <w:t>xL</w:t>
-      </w:r>
-      <w:proofErr w:type="spellEnd"/>
-      <w:r>
-        <w:rPr>
-          <w:rFonts w:ascii="Calibri Light" w:hAnsi="Calibri Light"/>
-          <w:b/>
-          <w:sz w:val="32"/>
-          <w:szCs w:val="26"/>
-        </w:rPr>
-        <w:t>​</w:t>
-      </w:r>
-      <w:proofErr w:type="spellStart"/>
-      <w:r>
-        <w:rPr>
-          <w:rFonts w:ascii="Calibri Light" w:hAnsi="Calibri Light"/>
-          <w:b/>
-          <w:sz w:val="32"/>
-          <w:szCs w:val="26"/>
-        </w:rPr>
-        <w:t>yL</w:t>
-      </w:r>
-      <w:proofErr w:type="spellEnd"/>
-      <w:r>
-        <w:rPr>
-          <w:rFonts w:ascii="Calibri Light" w:hAnsi="Calibri Light"/>
-          <w:b/>
-          <w:sz w:val="32"/>
-          <w:szCs w:val="26"/>
-        </w:rPr>
-        <w:t>​</w:t>
-      </w:r>
-      <w:proofErr w:type="spellStart"/>
-      <w:r>
-        <w:rPr>
-          <w:rFonts w:ascii="Calibri Light" w:hAnsi="Calibri Light"/>
-          <w:b/>
-          <w:sz w:val="32"/>
-          <w:szCs w:val="26"/>
-        </w:rPr>
-        <w:t>zL</w:t>
-      </w:r>
-      <w:proofErr w:type="spellEnd"/>
-      <w:r>
-        <w:rPr>
-          <w:rFonts w:ascii="Calibri Light" w:hAnsi="Calibri Light"/>
-          <w:b/>
-          <w:sz w:val="32"/>
-          <w:szCs w:val="26"/>
-        </w:rPr>
-        <w:t xml:space="preserve">​​​ </w:t>
-      </w:r>
-    </w:p>
-    <w:p>
-      <w:r>
-        <w:t xml:space="preserve">aggregiert aus </w:t>
-      </w:r>
-      <w:proofErr w:type="spellStart"/>
-      <w:r>
+      <w:r>
+        <w:rPr>
+          <w:rStyle w:val="CodeZchn"/>
+        </w:rPr>
         <w:t>mtr_rueckkopplung_lehrkraft_datenmaske</w:t>
       </w:r>
       <w:proofErr w:type="spellEnd"/>
@@ -3138,7 +2682,6 @@
     </w:p>
     <w:p>
       <w:r>
-        <w:lastRenderedPageBreak/>
         <w:t xml:space="preserve">Gerade dadurch wird das Modell wissenschaftlich kontrolliert und vermeidet kausale </w:t>
       </w:r>
       <w:proofErr w:type="spellStart"/>
@@ -3178,6 +2721,7 @@
         <w:pStyle w:val="berschrift4"/>
       </w:pPr>
       <w:r>
+        <w:lastRenderedPageBreak/>
         <w:t>3.X.3.7 Zusammenfassung</w:t>
       </w:r>
     </w:p>
@@ -3684,7 +3228,6 @@
                 <w:b/>
                 <w:bCs/>
               </w:rPr>
-              <w:lastRenderedPageBreak/>
               <w:t>Unterabschnitt</w:t>
             </w:r>
           </w:p>
@@ -3913,6 +3456,7 @@
               <w:rPr>
                 <w:rFonts w:ascii="Times New Roman" w:hAnsi="Times New Roman"/>
               </w:rPr>
+              <w:lastRenderedPageBreak/>
               <w:t>6.X</w:t>
             </w:r>
             <w:r>

</xml_diff>